<commit_message>
Suavizar el tono de la sección de variables excluidas por disponibilidad en oot
Se reemplaza el encuadre de "hallazgo crítico: fuga de información" por una
explicación más medida (no disponibilidad en oot.csv + correlación
contemporánea alta) en el Word, documento_tecnico.md, eda_notas.md,
presentacion_ejecutiva.md, mlops_parte1.md, arquitectura_produccion.md,
README.md y las salidas/comentarios de notebooks/01_eda.py (incluida la
etiqueta del gráfico de correlación). Sin cambios funcionales: 42/42
pruebas siguen pasando y documento_tecnico.md sigue bajo el límite de 4.000
caracteres (3.986).

Co-Authored-By: Claude Sonnet 5 <noreply@anthropic.com>
Claude-Session: https://claude.ai/code/session_01PVwTdMXAfoYeREFyFmbYA4
</commit_message>
<xml_diff>
--- a/docs/Documento_Metodologico_Prueba_Bancolombia.docx
+++ b/docs/Documento_Metodologico_Prueba_Bancolombia.docx
@@ -307,7 +307,7 @@
           <w:sz w:val="22"/>
           <w:szCs w:val="22"/>
         </w:rPr>
-        <w:t xml:space="preserve">se recibieron 4 tablas (trtest, master_customer_data, probabilidad_oblig_hist, maestra_cuotas_pagos_mes_hist) y oot.csv (enero-2024, solo IDs). El EDA reveló el hallazgo central: la mayoría de columnas de trtest (gestiones, pagos, alternativa aplicada, mora fin de mes) describen el resultado del mismo mes a predecir → fuga de información si se usan tal cual. Se rediseñó el pipeline para usar solo información de t-1 hacia atrás (lags propios de la obligación, snapshot demográfico más reciente ≤ corte, scores históricos del banco), replicando el escenario real de pronosticar un mes antes.</w:t>
+        <w:t xml:space="preserve">se recibieron 4 tablas (trtest, master_customer_data, probabilidad_oblig_hist, maestra_cuotas_pagos_mes_hist) y oot.csv (enero-2024, solo IDs). El EDA mostró que la mayoría de columnas de trtest (gestiones, pagos, alternativa aplicada, mora fin de mes) no están disponibles en oot.csv y, además, muestran una correlación contemporánea muy alta con el target, consistente con que describen eventos del mismo mes que se quiere predecir (detalle y evidencia en Anexo A, sección 4.2). Se rediseñó el pipeline para usar solo información de t-1 hacia atrás (lags propios de la obligación, snapshot demográfico más reciente ≤ corte, scores históricos del banco), replicando el escenario real de pronosticar un mes antes.</w:t>
       </w:r>
     </w:p>
     <w:p>
@@ -529,7 +529,7 @@
           <w:sz w:val="22"/>
           <w:szCs w:val="22"/>
         </w:rPr>
-        <w:t xml:space="preserve">ambos componentes son viables como prototipo demostrable dentro del alcance y tiempo de la prueba. El mayor riesgo de negocio no es el desempeño puntual del modelo sino la fuga de información si no se audita qué variables están realmente disponibles al momento de decidir — hallazgo válido tanto para la Parte 1 como para su integración con la Parte 2.</w:t>
+        <w:t xml:space="preserve">ambos componentes son viables como prototipo demostrable dentro del alcance y tiempo de la prueba. El mayor riesgo de negocio no es el desempeño puntual del modelo sino mantener la disciplina de auditar qué variables están realmente disponibles al momento de decidir — un punto válido tanto para la Parte 1 como para su integración con la Parte 2.</w:t>
       </w:r>
     </w:p>
     <w:p>
@@ -557,7 +557,7 @@
           <w:sz w:val="22"/>
           <w:szCs w:val="22"/>
         </w:rPr>
-        <w:t xml:space="preserve">Se usó Claude (Anthropic) como asistente de desarrollo de extremo a extremo: análisis exploratorio, identificación del riesgo de fuga de información, diseño del pipeline de features, entrenamiento del modelo, diseño de la arquitectura agéntica, e implementación de reglas/agentes/pruebas/documentación. El candidato dirigió el alcance, las decisiones de negocio (cooldowns, prioridades, qué construir dado el tiempo disponible) y revisó los resultados y supuestos antes de la entrega.</w:t>
+        <w:t xml:space="preserve">Se usó Claude (Anthropic) como asistente de desarrollo de extremo a extremo: análisis exploratorio, identificación de variables no disponibles en oot.csv y con señal contemporánea alta frente al target, diseño del pipeline de features, entrenamiento del modelo, diseño de la arquitectura agéntica, e implementación de reglas/agentes/pruebas/documentación. El candidato dirigió el alcance, las decisiones de negocio (cooldowns, prioridades, qué construir dado el tiempo disponible) y revisó los resultados y supuestos antes de la entrega.</w:t>
       </w:r>
     </w:p>
     <w:p>
@@ -1239,7 +1239,7 @@
           <w:bCs/>
           <w:color w:val="1F3B57"/>
         </w:rPr>
-        <w:t xml:space="preserve">4.2 Hallazgo crítico: fuga de información</w:t>
+        <w:t xml:space="preserve">4.2 Variables excluidas: disponibilidad en oot y consistencia temporal</w:t>
       </w:r>
     </w:p>
     <w:p>
@@ -1252,7 +1252,7 @@
           <w:sz w:val="22"/>
           <w:szCs w:val="22"/>
         </w:rPr>
-        <w:t xml:space="preserve">La mayoría de las columnas de trtest.csv (cant_gestiones, pago_mes, porc_pago_mes, marca_alternativa, dias_mora_fin, saldo_capital, entre otras) describen eventos ocurridos DURANTE el mismo mes de la variable respuesta: son consecuencia o coocurrencia directa de la decisión que se quiere predecir. Usarlas como variables contemporáneas habría producido un modelo con métricas artificialmente altas en validación, pero inútil en producción, porque esa información no existe todavía cuando hay que emitir el pronóstico un mes antes.</w:t>
+        <w:t xml:space="preserve">Al comparar trtest.csv contra oot.csv, la mayoría de las columnas de trtest (cant_gestiones, pago_mes, porc_pago_mes, marca_alternativa, dias_mora_fin, saldo_capital, entre otras) no están disponibles en oot. Adicionalmente, al revisar su correlación con la variable respuesta, estas mismas columnas muestran una correlación contemporánea inusualmente alta, consistente con que describen eventos ocurridos durante el mismo mes de la variable que se quiere predecir. Por ambas razones — no disponibilidad en oot y esa señal contemporánea difícil de justificar como predictiva — se decidió no usarlas en su versión del mismo mes: usarlas así habría producido un modelo con métricas artificialmente altas en validación, pero poco útil en producción, porque esa información no está disponible cuando hay que emitir el pronóstico un mes antes.</w:t>
       </w:r>
     </w:p>
     <w:p>
@@ -1326,7 +1326,7 @@
           <w:bCs/>
           <w:color w:val="1F3B57"/>
         </w:rPr>
-        <w:t xml:space="preserve">4.2.1 Evidencia empírica de la fuga (no solo argumento teórico)</w:t>
+        <w:t xml:space="preserve">4.2.1 Evidencia de respaldo: correlación contemporánea vs. rezagada</w:t>
       </w:r>
     </w:p>
     <w:p>
@@ -1339,7 +1339,7 @@
           <w:sz w:val="22"/>
           <w:szCs w:val="22"/>
         </w:rPr>
-        <w:t xml:space="preserve">notebooks/01_eda.py mide, para cada columna sospechosa, su correlación con el target en versión contemporánea (mismo mes) contra su versión rezagada a t-1. La caída es drástica y confirma que la correlación alta contemporánea es un artefacto de fuga, no señal predictiva real:</w:t>
+        <w:t xml:space="preserve">notebooks/01_eda.py mide, para cada columna, su correlación con el target en versión contemporánea (mismo mes) contra su versión rezagada a t-1. La caída es notoria y es coherente con que la correlación contemporánea refleja información no disponible al momento real de la decisión, más que señal predictiva propia:</w:t>
       </w:r>
     </w:p>
     <w:tbl>
@@ -1721,7 +1721,7 @@
           <w:sz w:val="22"/>
           <w:szCs w:val="22"/>
         </w:rPr>
-        <w:t xml:space="preserve">El conjunto de variables también se depura progresivamente a medida que avanza el pipeline (49 columnas crudas → 14 tras excluir IDs y columnas con fuga → 45 con historial propio rezagado → 81 con demografía → 85 con scores del banco → 92 con historial de cuotas/pagos → 76 variables finales, intersección con oot.csv):</w:t>
+        <w:t xml:space="preserve">El conjunto de variables también se depura progresivamente a medida que avanza el pipeline (49 columnas crudas → 14 tras excluir IDs y las columnas recién descritas → 45 con historial propio rezagado → 81 con demografía → 85 con scores del banco → 92 con historial de cuotas/pagos → 76 variables finales, intersección con oot.csv):</w:t>
       </w:r>
     </w:p>
     <w:p>
@@ -7897,7 +7897,7 @@
                 <w:sz w:val="20"/>
                 <w:szCs w:val="20"/>
               </w:rPr>
-              <w:t xml:space="preserve">Ejecución de código de exploración y detección del hallazgo de fuga de información</w:t>
+              <w:t xml:space="preserve">Ejecución de código de exploración e identificación de variables no disponibles en oot / con señal contemporánea alta</w:t>
             </w:r>
           </w:p>
         </w:tc>
@@ -7921,7 +7921,7 @@
                 <w:sz w:val="20"/>
                 <w:szCs w:val="20"/>
               </w:rPr>
-              <w:t xml:space="preserve">Validación del hallazgo y su relevancia para el negocio</w:t>
+              <w:t xml:space="preserve">Validación de esa decisión y su relevancia para el negocio</w:t>
             </w:r>
           </w:p>
         </w:tc>
@@ -7973,7 +7973,7 @@
                 <w:sz w:val="20"/>
                 <w:szCs w:val="20"/>
               </w:rPr>
-              <w:t xml:space="preserve">Propuesta e implementación del diseño "as-of" sin fuga</w:t>
+              <w:t xml:space="preserve">Propuesta e implementación del diseño "as-of" (solo información conocida antes del mes a predecir)</w:t>
             </w:r>
           </w:p>
         </w:tc>

</xml_diff>

<commit_message>
Documentar la configuración de hiperparámetros del modelo final
Se agrega, en el Word (Anexo A, sección 4.5.1) y en eda_notas.md, una tabla
con los hiperparámetros finales de LightGBM y su propósito, enmarcada como
una búsqueda controlada y dirigida (no una grilla exhaustiva), con una nota
de oportunidad de mejora: ampliar a una grilla más exigente (grid/random
search, Optuna) si se dispusiera de más capacidad de cómputo y tiempo.
Sin cambios de fondo en el modelo ni en sus métricas: 42/42 pruebas siguen
pasando y documento_tecnico.md sigue en 3.986/4.000 caracteres.

Co-Authored-By: Claude Sonnet 5 <noreply@anthropic.com>
Claude-Session: https://claude.ai/code/session_01PVwTdMXAfoYeREFyFmbYA4
</commit_message>
<xml_diff>
--- a/docs/Documento_Metodologico_Prueba_Bancolombia.docx
+++ b/docs/Documento_Metodologico_Prueba_Bancolombia.docx
@@ -2882,6 +2882,685 @@
           <w:szCs w:val="22"/>
         </w:rPr>
         <w:t xml:space="preserve">Nota de honestidad metodológica: la comparación favorece estructuralmente a LightGBM en un aspecto real, no accidental — maneja categóricas/nulos de forma nativa, mientras que Regresión Logística y Random Forest necesitaron one-hot + imputación (con ciiu, 446 categorías, agrupado a las 15 más frecuentes por necesidad de esos dos modelos). Esa capacidad nativa es justamente relevante para estos datos, no un artefacto que deba corregirse.</w:t>
+      </w:r>
+    </w:p>
+    <w:p>
+      <w:pPr>
+        <w:pStyle w:val="Heading3"/>
+        <w:spacing w:after="140" w:before="280"/>
+      </w:pPr>
+      <w:r>
+        <w:rPr>
+          <w:rFonts w:ascii="Calibri" w:cs="Calibri" w:eastAsia="Calibri" w:hAnsi="Calibri"/>
+          <w:b/>
+          <w:bCs/>
+          <w:color w:val="1F3B57"/>
+        </w:rPr>
+        <w:t xml:space="preserve">4.5.1 Configuración de hiperparámetros</w:t>
+      </w:r>
+    </w:p>
+    <w:p>
+      <w:pPr>
+        <w:spacing w:after="140"/>
+      </w:pPr>
+      <w:r>
+        <w:rPr>
+          <w:rFonts w:ascii="Calibri" w:cs="Calibri" w:eastAsia="Calibri" w:hAnsi="Calibri"/>
+          <w:sz w:val="22"/>
+          <w:szCs w:val="22"/>
+        </w:rPr>
+        <w:t xml:space="preserve">La configuración final de LightGBM surge de una búsqueda controlada y dirigida —no una grilla exhaustiva— apoyada en buenas prácticas conocidas para boosting sobre datos tabulares con riesgo de sobreajuste: regularización vía muestreo de filas y columnas, tamaño mínimo de hoja, y early stopping sobre el conjunto de validación:</w:t>
+      </w:r>
+    </w:p>
+    <w:tbl>
+      <w:tblPr>
+        <w:tblW w:type="dxa" w:w="9300"/>
+        <w:tblBorders>
+          <w:top w:val="single" w:color="auto" w:sz="4"/>
+          <w:left w:val="single" w:color="auto" w:sz="4"/>
+          <w:bottom w:val="single" w:color="auto" w:sz="4"/>
+          <w:right w:val="single" w:color="auto" w:sz="4"/>
+          <w:insideH w:val="single" w:color="auto" w:sz="4"/>
+          <w:insideV w:val="single" w:color="auto" w:sz="4"/>
+        </w:tblBorders>
+      </w:tblPr>
+      <w:tblGrid>
+        <w:gridCol w:w="3000"/>
+        <w:gridCol w:w="2000"/>
+        <w:gridCol w:w="4300"/>
+      </w:tblGrid>
+      <w:tr>
+        <w:trPr>
+          <w:tblHeader/>
+        </w:trPr>
+        <w:tc>
+          <w:tcPr>
+            <w:tcW w:type="dxa" w:w="3000"/>
+            <w:shd w:fill="1F3B57" w:val="clear"/>
+            <w:tcMar>
+              <w:top w:type="dxa" w:w="60"/>
+              <w:left w:type="dxa" w:w="100"/>
+              <w:bottom w:type="dxa" w:w="60"/>
+              <w:right w:type="dxa" w:w="100"/>
+            </w:tcMar>
+          </w:tcPr>
+          <w:p>
+            <w:r>
+              <w:rPr>
+                <w:rFonts w:ascii="Calibri" w:cs="Calibri" w:eastAsia="Calibri" w:hAnsi="Calibri"/>
+                <w:b/>
+                <w:bCs/>
+                <w:color w:val="FFFFFF"/>
+                <w:sz w:val="20"/>
+                <w:szCs w:val="20"/>
+              </w:rPr>
+              <w:t xml:space="preserve">Hiperparámetro</w:t>
+            </w:r>
+          </w:p>
+        </w:tc>
+        <w:tc>
+          <w:tcPr>
+            <w:tcW w:type="dxa" w:w="2000"/>
+            <w:shd w:fill="1F3B57" w:val="clear"/>
+            <w:tcMar>
+              <w:top w:type="dxa" w:w="60"/>
+              <w:left w:type="dxa" w:w="100"/>
+              <w:bottom w:type="dxa" w:w="60"/>
+              <w:right w:type="dxa" w:w="100"/>
+            </w:tcMar>
+          </w:tcPr>
+          <w:p>
+            <w:r>
+              <w:rPr>
+                <w:rFonts w:ascii="Calibri" w:cs="Calibri" w:eastAsia="Calibri" w:hAnsi="Calibri"/>
+                <w:b/>
+                <w:bCs/>
+                <w:color w:val="FFFFFF"/>
+                <w:sz w:val="20"/>
+                <w:szCs w:val="20"/>
+              </w:rPr>
+              <w:t xml:space="preserve">Valor final</w:t>
+            </w:r>
+          </w:p>
+        </w:tc>
+        <w:tc>
+          <w:tcPr>
+            <w:tcW w:type="dxa" w:w="4300"/>
+            <w:shd w:fill="1F3B57" w:val="clear"/>
+            <w:tcMar>
+              <w:top w:type="dxa" w:w="60"/>
+              <w:left w:type="dxa" w:w="100"/>
+              <w:bottom w:type="dxa" w:w="60"/>
+              <w:right w:type="dxa" w:w="100"/>
+            </w:tcMar>
+          </w:tcPr>
+          <w:p>
+            <w:r>
+              <w:rPr>
+                <w:rFonts w:ascii="Calibri" w:cs="Calibri" w:eastAsia="Calibri" w:hAnsi="Calibri"/>
+                <w:b/>
+                <w:bCs/>
+                <w:color w:val="FFFFFF"/>
+                <w:sz w:val="20"/>
+                <w:szCs w:val="20"/>
+              </w:rPr>
+              <w:t xml:space="preserve">Propósito</w:t>
+            </w:r>
+          </w:p>
+        </w:tc>
+      </w:tr>
+      <w:tr>
+        <w:tc>
+          <w:tcPr>
+            <w:tcW w:type="dxa" w:w="3000"/>
+            <w:tcMar>
+              <w:top w:type="dxa" w:w="60"/>
+              <w:left w:type="dxa" w:w="100"/>
+              <w:bottom w:type="dxa" w:w="60"/>
+              <w:right w:type="dxa" w:w="100"/>
+            </w:tcMar>
+          </w:tcPr>
+          <w:p>
+            <w:r>
+              <w:rPr>
+                <w:rFonts w:ascii="Calibri" w:cs="Calibri" w:eastAsia="Calibri" w:hAnsi="Calibri"/>
+                <w:b w:val="false"/>
+                <w:bCs w:val="false"/>
+                <w:color w:val="000000"/>
+                <w:sz w:val="20"/>
+                <w:szCs w:val="20"/>
+              </w:rPr>
+              <w:t xml:space="preserve">learning_rate</w:t>
+            </w:r>
+          </w:p>
+        </w:tc>
+        <w:tc>
+          <w:tcPr>
+            <w:tcW w:type="dxa" w:w="2000"/>
+            <w:tcMar>
+              <w:top w:type="dxa" w:w="60"/>
+              <w:left w:type="dxa" w:w="100"/>
+              <w:bottom w:type="dxa" w:w="60"/>
+              <w:right w:type="dxa" w:w="100"/>
+            </w:tcMar>
+          </w:tcPr>
+          <w:p>
+            <w:r>
+              <w:rPr>
+                <w:rFonts w:ascii="Calibri" w:cs="Calibri" w:eastAsia="Calibri" w:hAnsi="Calibri"/>
+                <w:b w:val="false"/>
+                <w:bCs w:val="false"/>
+                <w:color w:val="000000"/>
+                <w:sz w:val="20"/>
+                <w:szCs w:val="20"/>
+              </w:rPr>
+              <w:t xml:space="preserve">0.05</w:t>
+            </w:r>
+          </w:p>
+        </w:tc>
+        <w:tc>
+          <w:tcPr>
+            <w:tcW w:type="dxa" w:w="4300"/>
+            <w:tcMar>
+              <w:top w:type="dxa" w:w="60"/>
+              <w:left w:type="dxa" w:w="100"/>
+              <w:bottom w:type="dxa" w:w="60"/>
+              <w:right w:type="dxa" w:w="100"/>
+            </w:tcMar>
+          </w:tcPr>
+          <w:p>
+            <w:r>
+              <w:rPr>
+                <w:rFonts w:ascii="Calibri" w:cs="Calibri" w:eastAsia="Calibri" w:hAnsi="Calibri"/>
+                <w:b w:val="false"/>
+                <w:bCs w:val="false"/>
+                <w:color w:val="000000"/>
+                <w:sz w:val="20"/>
+                <w:szCs w:val="20"/>
+              </w:rPr>
+              <w:t xml:space="preserve">Paso de aprendizaje conservador</w:t>
+            </w:r>
+          </w:p>
+        </w:tc>
+      </w:tr>
+      <w:tr>
+        <w:tc>
+          <w:tcPr>
+            <w:tcW w:type="dxa" w:w="3000"/>
+            <w:shd w:fill="F2F2F2" w:val="clear"/>
+            <w:tcMar>
+              <w:top w:type="dxa" w:w="60"/>
+              <w:left w:type="dxa" w:w="100"/>
+              <w:bottom w:type="dxa" w:w="60"/>
+              <w:right w:type="dxa" w:w="100"/>
+            </w:tcMar>
+          </w:tcPr>
+          <w:p>
+            <w:r>
+              <w:rPr>
+                <w:rFonts w:ascii="Calibri" w:cs="Calibri" w:eastAsia="Calibri" w:hAnsi="Calibri"/>
+                <w:b w:val="false"/>
+                <w:bCs w:val="false"/>
+                <w:color w:val="000000"/>
+                <w:sz w:val="20"/>
+                <w:szCs w:val="20"/>
+              </w:rPr>
+              <w:t xml:space="preserve">num_leaves</w:t>
+            </w:r>
+          </w:p>
+        </w:tc>
+        <w:tc>
+          <w:tcPr>
+            <w:tcW w:type="dxa" w:w="2000"/>
+            <w:shd w:fill="F2F2F2" w:val="clear"/>
+            <w:tcMar>
+              <w:top w:type="dxa" w:w="60"/>
+              <w:left w:type="dxa" w:w="100"/>
+              <w:bottom w:type="dxa" w:w="60"/>
+              <w:right w:type="dxa" w:w="100"/>
+            </w:tcMar>
+          </w:tcPr>
+          <w:p>
+            <w:r>
+              <w:rPr>
+                <w:rFonts w:ascii="Calibri" w:cs="Calibri" w:eastAsia="Calibri" w:hAnsi="Calibri"/>
+                <w:b w:val="false"/>
+                <w:bCs w:val="false"/>
+                <w:color w:val="000000"/>
+                <w:sz w:val="20"/>
+                <w:szCs w:val="20"/>
+              </w:rPr>
+              <w:t xml:space="preserve">63</w:t>
+            </w:r>
+          </w:p>
+        </w:tc>
+        <w:tc>
+          <w:tcPr>
+            <w:tcW w:type="dxa" w:w="4300"/>
+            <w:shd w:fill="F2F2F2" w:val="clear"/>
+            <w:tcMar>
+              <w:top w:type="dxa" w:w="60"/>
+              <w:left w:type="dxa" w:w="100"/>
+              <w:bottom w:type="dxa" w:w="60"/>
+              <w:right w:type="dxa" w:w="100"/>
+            </w:tcMar>
+          </w:tcPr>
+          <w:p>
+            <w:r>
+              <w:rPr>
+                <w:rFonts w:ascii="Calibri" w:cs="Calibri" w:eastAsia="Calibri" w:hAnsi="Calibri"/>
+                <w:b w:val="false"/>
+                <w:bCs w:val="false"/>
+                <w:color w:val="000000"/>
+                <w:sz w:val="20"/>
+                <w:szCs w:val="20"/>
+              </w:rPr>
+              <w:t xml:space="preserve">Complejidad del árbol</w:t>
+            </w:r>
+          </w:p>
+        </w:tc>
+      </w:tr>
+      <w:tr>
+        <w:tc>
+          <w:tcPr>
+            <w:tcW w:type="dxa" w:w="3000"/>
+            <w:tcMar>
+              <w:top w:type="dxa" w:w="60"/>
+              <w:left w:type="dxa" w:w="100"/>
+              <w:bottom w:type="dxa" w:w="60"/>
+              <w:right w:type="dxa" w:w="100"/>
+            </w:tcMar>
+          </w:tcPr>
+          <w:p>
+            <w:r>
+              <w:rPr>
+                <w:rFonts w:ascii="Calibri" w:cs="Calibri" w:eastAsia="Calibri" w:hAnsi="Calibri"/>
+                <w:b w:val="false"/>
+                <w:bCs w:val="false"/>
+                <w:color w:val="000000"/>
+                <w:sz w:val="20"/>
+                <w:szCs w:val="20"/>
+              </w:rPr>
+              <w:t xml:space="preserve">min_data_in_leaf</w:t>
+            </w:r>
+          </w:p>
+        </w:tc>
+        <w:tc>
+          <w:tcPr>
+            <w:tcW w:type="dxa" w:w="2000"/>
+            <w:tcMar>
+              <w:top w:type="dxa" w:w="60"/>
+              <w:left w:type="dxa" w:w="100"/>
+              <w:bottom w:type="dxa" w:w="60"/>
+              <w:right w:type="dxa" w:w="100"/>
+            </w:tcMar>
+          </w:tcPr>
+          <w:p>
+            <w:r>
+              <w:rPr>
+                <w:rFonts w:ascii="Calibri" w:cs="Calibri" w:eastAsia="Calibri" w:hAnsi="Calibri"/>
+                <w:b w:val="false"/>
+                <w:bCs w:val="false"/>
+                <w:color w:val="000000"/>
+                <w:sz w:val="20"/>
+                <w:szCs w:val="20"/>
+              </w:rPr>
+              <w:t xml:space="preserve">100</w:t>
+            </w:r>
+          </w:p>
+        </w:tc>
+        <w:tc>
+          <w:tcPr>
+            <w:tcW w:type="dxa" w:w="4300"/>
+            <w:tcMar>
+              <w:top w:type="dxa" w:w="60"/>
+              <w:left w:type="dxa" w:w="100"/>
+              <w:bottom w:type="dxa" w:w="60"/>
+              <w:right w:type="dxa" w:w="100"/>
+            </w:tcMar>
+          </w:tcPr>
+          <w:p>
+            <w:r>
+              <w:rPr>
+                <w:rFonts w:ascii="Calibri" w:cs="Calibri" w:eastAsia="Calibri" w:hAnsi="Calibri"/>
+                <w:b w:val="false"/>
+                <w:bCs w:val="false"/>
+                <w:color w:val="000000"/>
+                <w:sz w:val="20"/>
+                <w:szCs w:val="20"/>
+              </w:rPr>
+              <w:t xml:space="preserve">Evita hojas sobreajustadas a pocos casos</w:t>
+            </w:r>
+          </w:p>
+        </w:tc>
+      </w:tr>
+      <w:tr>
+        <w:tc>
+          <w:tcPr>
+            <w:tcW w:type="dxa" w:w="3000"/>
+            <w:shd w:fill="F2F2F2" w:val="clear"/>
+            <w:tcMar>
+              <w:top w:type="dxa" w:w="60"/>
+              <w:left w:type="dxa" w:w="100"/>
+              <w:bottom w:type="dxa" w:w="60"/>
+              <w:right w:type="dxa" w:w="100"/>
+            </w:tcMar>
+          </w:tcPr>
+          <w:p>
+            <w:r>
+              <w:rPr>
+                <w:rFonts w:ascii="Calibri" w:cs="Calibri" w:eastAsia="Calibri" w:hAnsi="Calibri"/>
+                <w:b w:val="false"/>
+                <w:bCs w:val="false"/>
+                <w:color w:val="000000"/>
+                <w:sz w:val="20"/>
+                <w:szCs w:val="20"/>
+              </w:rPr>
+              <w:t xml:space="preserve">feature_fraction</w:t>
+            </w:r>
+          </w:p>
+        </w:tc>
+        <w:tc>
+          <w:tcPr>
+            <w:tcW w:type="dxa" w:w="2000"/>
+            <w:shd w:fill="F2F2F2" w:val="clear"/>
+            <w:tcMar>
+              <w:top w:type="dxa" w:w="60"/>
+              <w:left w:type="dxa" w:w="100"/>
+              <w:bottom w:type="dxa" w:w="60"/>
+              <w:right w:type="dxa" w:w="100"/>
+            </w:tcMar>
+          </w:tcPr>
+          <w:p>
+            <w:r>
+              <w:rPr>
+                <w:rFonts w:ascii="Calibri" w:cs="Calibri" w:eastAsia="Calibri" w:hAnsi="Calibri"/>
+                <w:b w:val="false"/>
+                <w:bCs w:val="false"/>
+                <w:color w:val="000000"/>
+                <w:sz w:val="20"/>
+                <w:szCs w:val="20"/>
+              </w:rPr>
+              <w:t xml:space="preserve">0.8</w:t>
+            </w:r>
+          </w:p>
+        </w:tc>
+        <w:tc>
+          <w:tcPr>
+            <w:tcW w:type="dxa" w:w="4300"/>
+            <w:shd w:fill="F2F2F2" w:val="clear"/>
+            <w:tcMar>
+              <w:top w:type="dxa" w:w="60"/>
+              <w:left w:type="dxa" w:w="100"/>
+              <w:bottom w:type="dxa" w:w="60"/>
+              <w:right w:type="dxa" w:w="100"/>
+            </w:tcMar>
+          </w:tcPr>
+          <w:p>
+            <w:r>
+              <w:rPr>
+                <w:rFonts w:ascii="Calibri" w:cs="Calibri" w:eastAsia="Calibri" w:hAnsi="Calibri"/>
+                <w:b w:val="false"/>
+                <w:bCs w:val="false"/>
+                <w:color w:val="000000"/>
+                <w:sz w:val="20"/>
+                <w:szCs w:val="20"/>
+              </w:rPr>
+              <w:t xml:space="preserve">Muestreo de columnas por árbol (regularización)</w:t>
+            </w:r>
+          </w:p>
+        </w:tc>
+      </w:tr>
+      <w:tr>
+        <w:tc>
+          <w:tcPr>
+            <w:tcW w:type="dxa" w:w="3000"/>
+            <w:tcMar>
+              <w:top w:type="dxa" w:w="60"/>
+              <w:left w:type="dxa" w:w="100"/>
+              <w:bottom w:type="dxa" w:w="60"/>
+              <w:right w:type="dxa" w:w="100"/>
+            </w:tcMar>
+          </w:tcPr>
+          <w:p>
+            <w:r>
+              <w:rPr>
+                <w:rFonts w:ascii="Calibri" w:cs="Calibri" w:eastAsia="Calibri" w:hAnsi="Calibri"/>
+                <w:b w:val="false"/>
+                <w:bCs w:val="false"/>
+                <w:color w:val="000000"/>
+                <w:sz w:val="20"/>
+                <w:szCs w:val="20"/>
+              </w:rPr>
+              <w:t xml:space="preserve">bagging_fraction</w:t>
+            </w:r>
+          </w:p>
+        </w:tc>
+        <w:tc>
+          <w:tcPr>
+            <w:tcW w:type="dxa" w:w="2000"/>
+            <w:tcMar>
+              <w:top w:type="dxa" w:w="60"/>
+              <w:left w:type="dxa" w:w="100"/>
+              <w:bottom w:type="dxa" w:w="60"/>
+              <w:right w:type="dxa" w:w="100"/>
+            </w:tcMar>
+          </w:tcPr>
+          <w:p>
+            <w:r>
+              <w:rPr>
+                <w:rFonts w:ascii="Calibri" w:cs="Calibri" w:eastAsia="Calibri" w:hAnsi="Calibri"/>
+                <w:b w:val="false"/>
+                <w:bCs w:val="false"/>
+                <w:color w:val="000000"/>
+                <w:sz w:val="20"/>
+                <w:szCs w:val="20"/>
+              </w:rPr>
+              <w:t xml:space="preserve">0.8</w:t>
+            </w:r>
+          </w:p>
+        </w:tc>
+        <w:tc>
+          <w:tcPr>
+            <w:tcW w:type="dxa" w:w="4300"/>
+            <w:tcMar>
+              <w:top w:type="dxa" w:w="60"/>
+              <w:left w:type="dxa" w:w="100"/>
+              <w:bottom w:type="dxa" w:w="60"/>
+              <w:right w:type="dxa" w:w="100"/>
+            </w:tcMar>
+          </w:tcPr>
+          <w:p>
+            <w:r>
+              <w:rPr>
+                <w:rFonts w:ascii="Calibri" w:cs="Calibri" w:eastAsia="Calibri" w:hAnsi="Calibri"/>
+                <w:b w:val="false"/>
+                <w:bCs w:val="false"/>
+                <w:color w:val="000000"/>
+                <w:sz w:val="20"/>
+                <w:szCs w:val="20"/>
+              </w:rPr>
+              <w:t xml:space="preserve">Muestreo de filas por iteración (regularización)</w:t>
+            </w:r>
+          </w:p>
+        </w:tc>
+      </w:tr>
+      <w:tr>
+        <w:tc>
+          <w:tcPr>
+            <w:tcW w:type="dxa" w:w="3000"/>
+            <w:shd w:fill="F2F2F2" w:val="clear"/>
+            <w:tcMar>
+              <w:top w:type="dxa" w:w="60"/>
+              <w:left w:type="dxa" w:w="100"/>
+              <w:bottom w:type="dxa" w:w="60"/>
+              <w:right w:type="dxa" w:w="100"/>
+            </w:tcMar>
+          </w:tcPr>
+          <w:p>
+            <w:r>
+              <w:rPr>
+                <w:rFonts w:ascii="Calibri" w:cs="Calibri" w:eastAsia="Calibri" w:hAnsi="Calibri"/>
+                <w:b w:val="false"/>
+                <w:bCs w:val="false"/>
+                <w:color w:val="000000"/>
+                <w:sz w:val="20"/>
+                <w:szCs w:val="20"/>
+              </w:rPr>
+              <w:t xml:space="preserve">early_stopping_rounds</w:t>
+            </w:r>
+          </w:p>
+        </w:tc>
+        <w:tc>
+          <w:tcPr>
+            <w:tcW w:type="dxa" w:w="2000"/>
+            <w:shd w:fill="F2F2F2" w:val="clear"/>
+            <w:tcMar>
+              <w:top w:type="dxa" w:w="60"/>
+              <w:left w:type="dxa" w:w="100"/>
+              <w:bottom w:type="dxa" w:w="60"/>
+              <w:right w:type="dxa" w:w="100"/>
+            </w:tcMar>
+          </w:tcPr>
+          <w:p>
+            <w:r>
+              <w:rPr>
+                <w:rFonts w:ascii="Calibri" w:cs="Calibri" w:eastAsia="Calibri" w:hAnsi="Calibri"/>
+                <w:b w:val="false"/>
+                <w:bCs w:val="false"/>
+                <w:color w:val="000000"/>
+                <w:sz w:val="20"/>
+                <w:szCs w:val="20"/>
+              </w:rPr>
+              <w:t xml:space="preserve">50</w:t>
+            </w:r>
+          </w:p>
+        </w:tc>
+        <w:tc>
+          <w:tcPr>
+            <w:tcW w:type="dxa" w:w="4300"/>
+            <w:shd w:fill="F2F2F2" w:val="clear"/>
+            <w:tcMar>
+              <w:top w:type="dxa" w:w="60"/>
+              <w:left w:type="dxa" w:w="100"/>
+              <w:bottom w:type="dxa" w:w="60"/>
+              <w:right w:type="dxa" w:w="100"/>
+            </w:tcMar>
+          </w:tcPr>
+          <w:p>
+            <w:r>
+              <w:rPr>
+                <w:rFonts w:ascii="Calibri" w:cs="Calibri" w:eastAsia="Calibri" w:hAnsi="Calibri"/>
+                <w:b w:val="false"/>
+                <w:bCs w:val="false"/>
+                <w:color w:val="000000"/>
+                <w:sz w:val="20"/>
+                <w:szCs w:val="20"/>
+              </w:rPr>
+              <w:t xml:space="preserve">Detiene el entrenamiento si valid no mejora</w:t>
+            </w:r>
+          </w:p>
+        </w:tc>
+      </w:tr>
+      <w:tr>
+        <w:tc>
+          <w:tcPr>
+            <w:tcW w:type="dxa" w:w="3000"/>
+            <w:tcMar>
+              <w:top w:type="dxa" w:w="60"/>
+              <w:left w:type="dxa" w:w="100"/>
+              <w:bottom w:type="dxa" w:w="60"/>
+              <w:right w:type="dxa" w:w="100"/>
+            </w:tcMar>
+          </w:tcPr>
+          <w:p>
+            <w:r>
+              <w:rPr>
+                <w:rFonts w:ascii="Calibri" w:cs="Calibri" w:eastAsia="Calibri" w:hAnsi="Calibri"/>
+                <w:b w:val="false"/>
+                <w:bCs w:val="false"/>
+                <w:color w:val="000000"/>
+                <w:sz w:val="20"/>
+                <w:szCs w:val="20"/>
+              </w:rPr>
+              <w:t xml:space="preserve">num_boost_round (máx.)</w:t>
+            </w:r>
+          </w:p>
+        </w:tc>
+        <w:tc>
+          <w:tcPr>
+            <w:tcW w:type="dxa" w:w="2000"/>
+            <w:tcMar>
+              <w:top w:type="dxa" w:w="60"/>
+              <w:left w:type="dxa" w:w="100"/>
+              <w:bottom w:type="dxa" w:w="60"/>
+              <w:right w:type="dxa" w:w="100"/>
+            </w:tcMar>
+          </w:tcPr>
+          <w:p>
+            <w:r>
+              <w:rPr>
+                <w:rFonts w:ascii="Calibri" w:cs="Calibri" w:eastAsia="Calibri" w:hAnsi="Calibri"/>
+                <w:b w:val="false"/>
+                <w:bCs w:val="false"/>
+                <w:color w:val="000000"/>
+                <w:sz w:val="20"/>
+                <w:szCs w:val="20"/>
+              </w:rPr>
+              <w:t xml:space="preserve">2000</w:t>
+            </w:r>
+          </w:p>
+        </w:tc>
+        <w:tc>
+          <w:tcPr>
+            <w:tcW w:type="dxa" w:w="4300"/>
+            <w:tcMar>
+              <w:top w:type="dxa" w:w="60"/>
+              <w:left w:type="dxa" w:w="100"/>
+              <w:bottom w:type="dxa" w:w="60"/>
+              <w:right w:type="dxa" w:w="100"/>
+            </w:tcMar>
+          </w:tcPr>
+          <w:p>
+            <w:r>
+              <w:rPr>
+                <w:rFonts w:ascii="Calibri" w:cs="Calibri" w:eastAsia="Calibri" w:hAnsi="Calibri"/>
+                <w:b w:val="false"/>
+                <w:bCs w:val="false"/>
+                <w:color w:val="000000"/>
+                <w:sz w:val="20"/>
+                <w:szCs w:val="20"/>
+              </w:rPr>
+              <w:t xml:space="preserve">Techo; mejor iteración real alcanzada: 370</w:t>
+            </w:r>
+          </w:p>
+        </w:tc>
+      </w:tr>
+    </w:tbl>
+    <w:p>
+      <w:pPr>
+        <w:spacing w:after="140"/>
+      </w:pPr>
+      <w:r>
+        <w:rPr>
+          <w:rFonts w:ascii="Calibri" w:cs="Calibri" w:eastAsia="Calibri" w:hAnsi="Calibri"/>
+          <w:sz w:val="22"/>
+          <w:szCs w:val="22"/>
+        </w:rPr>
+        <w:t xml:space="preserve">Random Forest y Regresión Logística (los otros dos modelos comparados en la sección 4.5) usan igualmente una configuración fija con el mismo criterio de regularización (p. ej. Random Forest: n_estimators=200, max_depth=12, min_samples_leaf=50), sin una búsqueda adicional sobre ellos, dado que no fueron los modelos seleccionados.</w:t>
+      </w:r>
+    </w:p>
+    <w:p>
+      <w:pPr>
+        <w:spacing w:after="140"/>
+      </w:pPr>
+      <w:r>
+        <w:rPr>
+          <w:rFonts w:ascii="Calibri" w:cs="Calibri" w:eastAsia="Calibri" w:hAnsi="Calibri"/>
+          <w:sz w:val="22"/>
+          <w:szCs w:val="22"/>
+        </w:rPr>
+        <w:t xml:space="preserve">Oportunidad de mejora: esta búsqueda dirigida se puede ampliar a una grilla más exigente (grid search, random search u Optuna) sobre un rango más amplio de valores si se quisiera explorar el espacio de hiperparámetros de forma más sistemática — a costa de mayor capacidad de cómputo y tiempo de entrenamiento, no justificado dentro del alcance de esta prueba.</w:t>
       </w:r>
     </w:p>
     <w:p>

</xml_diff>

<commit_message>
Ajustar declaracion de uso de IA con la redaccion propia del candidato
Reescribe el parrafo en documento_tecnico.md y la seccion 8.1 (Anexo E)
del Word para reflejar el rol del candidato como quien guio la
metodologia en cada etapa, valido y contrasto los resultados frente a
los supuestos y parametros de la prueba, y agrega la mencion de la
replica completa del pipeline en entorno local como verificacion
independiente antes de la entrega. Verificado que documento_tecnico.md
sigue bajo el limite de 4000 caracteres (3873).

Co-Authored-By: Claude Sonnet 5 <noreply@anthropic.com>
Claude-Session: https://claude.ai/code/session_01PVwTdMXAfoYeREFyFmbYA4
</commit_message>
<xml_diff>
--- a/docs/Documento_Metodologico_Prueba_Bancolombia.docx
+++ b/docs/Documento_Metodologico_Prueba_Bancolombia.docx
@@ -8826,7 +8826,7 @@
           <w:sz w:val="22"/>
           <w:szCs w:val="22"/>
         </w:rPr>
-        <w:t xml:space="preserve">Herramienta utilizada: Claude (Anthropic), a través de Claude Code/Cowork, durante toda la prueba.</w:t>
+        <w:t xml:space="preserve">Herramienta utilizada: Claude (Anthropic), a través de Claude Code/Cowork, durante toda la prueba. El candidato guio la metodología a seguir en cada etapa, validando y contrastando los resultados frente a los supuestos y parámetros de la prueba.</w:t>
       </w:r>
     </w:p>
     <w:tbl>
@@ -9313,7 +9313,7 @@
           <w:sz w:val="22"/>
           <w:szCs w:val="22"/>
         </w:rPr>
-        <w:t xml:space="preserve">Ninguna sección de este documento fue tomada de fuentes externas sin adaptación al contexto específico de esta prueba; todo el código fue ejecutado y verificado antes de incluirse en la entrega.</w:t>
+        <w:t xml:space="preserve">El candidato además replicó el pipeline completo (Parte 1 y Parte 2) en su propio entorno local, paso a paso, como verificación independiente de principio a fin antes de la entrega (ver README.md, sección "Cómo reproducir"). Ninguna sección de este documento fue tomada de fuentes externas sin adaptación al contexto específico de esta prueba; todo el código fue ejecutado y verificado antes de incluirse en la entrega.</w:t>
       </w:r>
     </w:p>
     <w:p>

</xml_diff>

<commit_message>
Redactar toda la declaracion de uso de IA en primera persona
Se elimina la referencia en tercera persona "el candidato" en todo el
documento tecnico, mlops_parte1.md y el Word (seccion 3.3 y Anexo E),
reemplazandola por primera persona ("yo dirigi", "yo gui", "mi rol")
para reflejar con precision quien realizo cada actividad.

Co-Authored-By: Claude Sonnet 5 <noreply@anthropic.com>
Claude-Session: https://claude.ai/code/session_01PVwTdMXAfoYeREFyFmbYA4
</commit_message>
<xml_diff>
--- a/docs/Documento_Metodologico_Prueba_Bancolombia.docx
+++ b/docs/Documento_Metodologico_Prueba_Bancolombia.docx
@@ -557,7 +557,7 @@
           <w:sz w:val="22"/>
           <w:szCs w:val="22"/>
         </w:rPr>
-        <w:t xml:space="preserve">Se usó Claude (Anthropic) como asistente de desarrollo de extremo a extremo: análisis exploratorio, identificación de variables no disponibles en oot.csv y con señal contemporánea alta frente al target, diseño del pipeline de features, entrenamiento del modelo, diseño de la arquitectura agéntica, e implementación de reglas/agentes/pruebas/documentación. El candidato dirigió el alcance, las decisiones de negocio (cooldowns, prioridades, qué construir dado el tiempo disponible) y revisó los resultados y supuestos antes de la entrega.</w:t>
+        <w:t xml:space="preserve">Usé Claude (Anthropic) como asistente de desarrollo de extremo a extremo: análisis exploratorio, identificación de variables no disponibles en oot.csv y con señal contemporánea alta frente al target, diseño del pipeline de features, entrenamiento del modelo, diseño de la arquitectura agéntica, e implementación de reglas/agentes/pruebas/documentación. Yo dirigí el alcance, las decisiones de negocio (cooldowns, prioridades, qué construir dado el tiempo disponible) y revisé los resultados y supuestos antes de la entrega.</w:t>
       </w:r>
     </w:p>
     <w:p>
@@ -8826,7 +8826,7 @@
           <w:sz w:val="22"/>
           <w:szCs w:val="22"/>
         </w:rPr>
-        <w:t xml:space="preserve">Herramienta utilizada: Claude (Anthropic), a través de Claude Code/Cowork, durante toda la prueba. El candidato guio la metodología a seguir en cada etapa, validando y contrastando los resultados frente a los supuestos y parámetros de la prueba.</w:t>
+        <w:t xml:space="preserve">Herramienta utilizada: Claude (Anthropic), a través de Claude Code/Cowork, durante toda la prueba. Yo guié la metodología a seguir en cada etapa, validando y contrastando los resultados frente a los supuestos y parámetros de la prueba.</w:t>
       </w:r>
     </w:p>
     <w:tbl>
@@ -8921,7 +8921,7 @@
                 <w:sz w:val="20"/>
                 <w:szCs w:val="20"/>
               </w:rPr>
-              <w:t xml:space="preserve">Rol del candidato</w:t>
+              <w:t xml:space="preserve">Mi rol</w:t>
             </w:r>
           </w:p>
         </w:tc>
@@ -8995,7 +8995,7 @@
                 <w:sz w:val="20"/>
                 <w:szCs w:val="20"/>
               </w:rPr>
-              <w:t xml:space="preserve">Validación de esa decisión y su relevancia para el negocio</w:t>
+              <w:t xml:space="preserve">Validé esa decisión y su relevancia para el negocio</w:t>
             </w:r>
           </w:p>
         </w:tc>
@@ -9072,7 +9072,7 @@
                 <w:sz w:val="20"/>
                 <w:szCs w:val="20"/>
               </w:rPr>
-              <w:t xml:space="preserve">Revisión de la lógica y de los supuestos de cooldown/ventanas</w:t>
+              <w:t xml:space="preserve">Revisé la lógica y los supuestos de cooldown/ventanas</w:t>
             </w:r>
           </w:p>
         </w:tc>
@@ -9146,7 +9146,7 @@
                 <w:sz w:val="20"/>
                 <w:szCs w:val="20"/>
               </w:rPr>
-              <w:t xml:space="preserve">Definición del criterio de éxito (F1) y revisión de resultados</w:t>
+              <w:t xml:space="preserve">Definí el criterio de éxito (F1) y revisé los resultados</w:t>
             </w:r>
           </w:p>
         </w:tc>
@@ -9223,7 +9223,7 @@
                 <w:sz w:val="20"/>
                 <w:szCs w:val="20"/>
               </w:rPr>
-              <w:t xml:space="preserve">Definición de reglas de negocio, alcance y priorización dado el tiempo disponible</w:t>
+              <w:t xml:space="preserve">Definí las reglas de negocio, el alcance y la priorización dado el tiempo disponible</w:t>
             </w:r>
           </w:p>
         </w:tc>
@@ -9297,7 +9297,7 @@
                 <w:sz w:val="20"/>
                 <w:szCs w:val="20"/>
               </w:rPr>
-              <w:t xml:space="preserve">Revisión, ajuste y validación del contenido antes de la entrega</w:t>
+              <w:t xml:space="preserve">Revisé, ajusté y validé el contenido antes de la entrega</w:t>
             </w:r>
           </w:p>
         </w:tc>
@@ -9313,7 +9313,7 @@
           <w:sz w:val="22"/>
           <w:szCs w:val="22"/>
         </w:rPr>
-        <w:t xml:space="preserve">El candidato además replicó el pipeline completo (Parte 1 y Parte 2) en su propio entorno local, paso a paso, como verificación independiente de principio a fin antes de la entrega (ver README.md, sección "Cómo reproducir"). Ninguna sección de este documento fue tomada de fuentes externas sin adaptación al contexto específico de esta prueba; todo el código fue ejecutado y verificado antes de incluirse en la entrega.</w:t>
+        <w:t xml:space="preserve">Yo además repliqué el pipeline completo (Parte 1 y Parte 2) en mi propio entorno local, paso a paso, como verificación independiente de principio a fin antes de la entrega (ver README.md, sección "Cómo reproducir"). Ninguna sección de este documento fue tomada de fuentes externas sin adaptación al contexto específico de esta prueba; todo el código fue ejecutado y verificado antes de incluirse en la entrega.</w:t>
       </w:r>
     </w:p>
     <w:p>

</xml_diff>